<commit_message>
Tell the team how a preview becomes the public Vercel address.
A push of this branch creates a Preview. Production stays put until that deployment is promoted, or until the production branch is set to this branch.

Co-authored-by: DanLejerskar <DanLejerskar@users.noreply.github.com>
</commit_message>
<xml_diff>
--- a/eon-product-overview/HANDOVER.docx
+++ b/eon-product-overview/HANDOVER.docx
@@ -374,6 +374,11 @@
       </w:pPr>
       <w:r>
         <w:t>If it is a Preview, promote that deployment to Production. Promote only inside eon-reality-website.</w:t>
+      </w:r>
+    </w:p>
+    <w:p>
+      <w:r>
+        <w:t>A push of this branch creates a Preview, because the Vercel production branch is still main. The public address stays on the last Production deployment until you promote. If Promote is refused, open the project settings for eon-reality-website and set the Production Branch to cursor/eon-product-overview-589c. Do that only on this project.</w:t>
       </w:r>
     </w:p>
     <w:p>

</xml_diff>

<commit_message>
Add the bot brief and cover email for Raul and Brita.
The HTML preview stays the base. The brief lists what the live WordPress site still has, what the preview still lacks, and how an agent adds the six hero films.

Co-authored-by: DanLejerskar <DanLejerskar@users.noreply.github.com>
</commit_message>
<xml_diff>
--- a/eon-product-overview/HANDOVER.docx
+++ b/eon-product-overview/HANDOVER.docx
@@ -33,6 +33,11 @@
     <w:p>
       <w:r>
         <w:t>Read this file before you edit anything. The cover email is COVER-EMAIL.md in this same folder.</w:t>
+      </w:r>
+    </w:p>
+    <w:p>
+      <w:r>
+        <w:t>On 16 Oct 2026 Dan asked Raul and Brita to start from this HTML preview, cross-check it with the live WordPress site, and let their agents do the work. That brief is BOT-BRIEF-RAUL-BRITA.md. The note that goes with it is COVER-EMAIL-BOTS.md. Both are drafts. Neither has been sent.</w:t>
       </w:r>
     </w:p>
     <w:p>

</xml_diff>